<commit_message>
Prune orphan dialogue in chapters; add editorial tools and publish docs.
- Updated Kir и Анфи chapter DOCX after proofread and orphan pruning

- Added prune_orphan_dialogue.py, export_prepress_book.py, PUBLISH.md

- pipeline aliases, AGENTS MCP indexing policy, prompt cleanup

Co-authored-by: Cursor <cursoragent@cursor.com>
</commit_message>
<xml_diff>
--- a/output/books/Kir и Анфи/Глава_03_Февраль_2025.docx
+++ b/output/books/Kir и Анфи/Глава_03_Февраль_2025.docx
@@ -172,98 +172,6 @@
     </w:p>
     <w:p>
       <w:pPr>
-        <w:spacing w:before="200" w:after="40"/>
-        <w:ind w:firstLine="0"/>
-      </w:pPr>
-      <w:r>
-        <w:rPr>
-          <w:rFonts w:ascii="Times New Roman" w:hAnsi="Times New Roman" w:cs="Times New Roman" w:eastAsia="Times New Roman"/>
-          <w:b/>
-          <w:i w:val="0"/>
-          <w:color w:val="C00000"/>
-          <w:sz w:val="24"/>
-        </w:rPr>
-        <w:t>Kir</w:t>
-      </w:r>
-      <w:r>
-        <w:rPr>
-          <w:rFonts w:ascii="Times New Roman" w:hAnsi="Times New Roman" w:cs="Times New Roman" w:eastAsia="Times New Roman"/>
-          <w:b w:val="0"/>
-          <w:i/>
-          <w:color w:val="6B6B6B"/>
-          <w:sz w:val="18"/>
-        </w:rPr>
-        <w:t xml:space="preserve">   ·   13:02</w:t>
-      </w:r>
-    </w:p>
-    <w:p>
-      <w:pPr>
-        <w:spacing w:after="160" w:line="276" w:lineRule="auto"/>
-        <w:ind w:firstLine="425"/>
-        <w:jc w:val="both"/>
-        <w:pBdr>
-          <w:left w:val="single" w:sz="12" w:space="8" w:color="C00000"/>
-        </w:pBdr>
-      </w:pPr>
-      <w:r>
-        <w:rPr>
-          <w:rFonts w:ascii="Times New Roman" w:hAnsi="Times New Roman" w:cs="Times New Roman" w:eastAsia="Times New Roman"/>
-          <w:b w:val="0"/>
-          <w:i w:val="0"/>
-          <w:color w:val="C00000"/>
-          <w:sz w:val="24"/>
-        </w:rPr>
-        <w:t>Созвонимся?</w:t>
-      </w:r>
-    </w:p>
-    <w:p>
-      <w:pPr>
-        <w:spacing w:before="200" w:after="40"/>
-        <w:ind w:firstLine="0"/>
-      </w:pPr>
-      <w:r>
-        <w:rPr>
-          <w:rFonts w:ascii="Times New Roman" w:hAnsi="Times New Roman" w:cs="Times New Roman" w:eastAsia="Times New Roman"/>
-          <w:b/>
-          <w:i w:val="0"/>
-          <w:color w:val="1F4E79"/>
-          <w:sz w:val="24"/>
-        </w:rPr>
-        <w:t>Анфи</w:t>
-      </w:r>
-      <w:r>
-        <w:rPr>
-          <w:rFonts w:ascii="Times New Roman" w:hAnsi="Times New Roman" w:cs="Times New Roman" w:eastAsia="Times New Roman"/>
-          <w:b w:val="0"/>
-          <w:i/>
-          <w:color w:val="6B6B6B"/>
-          <w:sz w:val="18"/>
-        </w:rPr>
-        <w:t xml:space="preserve">   ·   13:07</w:t>
-      </w:r>
-    </w:p>
-    <w:p>
-      <w:pPr>
-        <w:spacing w:after="160" w:line="276" w:lineRule="auto"/>
-        <w:ind w:firstLine="425"/>
-        <w:jc w:val="both"/>
-        <w:pBdr>
-          <w:left w:val="single" w:sz="12" w:space="8" w:color="1F4E79"/>
-        </w:pBdr>
-      </w:pPr>
-      <w:r>
-        <w:rPr>
-          <w:rFonts w:ascii="Times New Roman" w:hAnsi="Times New Roman" w:cs="Times New Roman" w:eastAsia="Times New Roman"/>
-          <w:b w:val="0"/>
-          <w:i w:val="0"/>
-          <w:color w:val="1F4E79"/>
-          <w:sz w:val="24"/>
-        </w:rPr>
-        <w:t>Нет, сейчас не созвонимся, и вообще не знаю, как, ну, типа, вечером. Короче, не обещаю.</w:t>
-      </w:r>
-    </w:p>
-    <w:p>
-      <w:pPr>
         <w:spacing w:before="360" w:after="160"/>
         <w:ind w:firstLine="0"/>
         <w:jc w:val="left"/>
@@ -634,52 +542,6 @@
           <w:rFonts w:ascii="Times New Roman" w:hAnsi="Times New Roman" w:cs="Times New Roman" w:eastAsia="Times New Roman"/>
           <w:b/>
           <w:i w:val="0"/>
-          <w:color w:val="C00000"/>
-          <w:sz w:val="24"/>
-        </w:rPr>
-        <w:t>Kir</w:t>
-      </w:r>
-      <w:r>
-        <w:rPr>
-          <w:rFonts w:ascii="Times New Roman" w:hAnsi="Times New Roman" w:cs="Times New Roman" w:eastAsia="Times New Roman"/>
-          <w:b w:val="0"/>
-          <w:i/>
-          <w:color w:val="6B6B6B"/>
-          <w:sz w:val="18"/>
-        </w:rPr>
-        <w:t xml:space="preserve">   ·   18:04</w:t>
-      </w:r>
-    </w:p>
-    <w:p>
-      <w:pPr>
-        <w:spacing w:after="160" w:line="276" w:lineRule="auto"/>
-        <w:ind w:firstLine="425"/>
-        <w:jc w:val="both"/>
-        <w:pBdr>
-          <w:left w:val="single" w:sz="12" w:space="8" w:color="C00000"/>
-        </w:pBdr>
-      </w:pPr>
-      <w:r>
-        <w:rPr>
-          <w:rFonts w:ascii="Times New Roman" w:hAnsi="Times New Roman" w:cs="Times New Roman" w:eastAsia="Times New Roman"/>
-          <w:b w:val="0"/>
-          <w:i w:val="0"/>
-          <w:color w:val="C00000"/>
-          <w:sz w:val="24"/>
-        </w:rPr>
-        <w:t>Здравствуйте, Анфия Премудрая. Как ваши дела?</w:t>
-      </w:r>
-    </w:p>
-    <w:p>
-      <w:pPr>
-        <w:spacing w:before="200" w:after="40"/>
-        <w:ind w:firstLine="0"/>
-      </w:pPr>
-      <w:r>
-        <w:rPr>
-          <w:rFonts w:ascii="Times New Roman" w:hAnsi="Times New Roman" w:cs="Times New Roman" w:eastAsia="Times New Roman"/>
-          <w:b/>
-          <w:i w:val="0"/>
           <w:color w:val="1F4E79"/>
           <w:sz w:val="24"/>
         </w:rPr>
@@ -911,13 +773,11 @@
       </w:pPr>
       <w:r>
         <w:rPr>
-          <w:rFonts w:ascii="Times New Roman" w:hAnsi="Times New Roman" w:cs="Times New Roman" w:eastAsia="Times New Roman"/>
-          <w:b w:val="0"/>
-          <w:i w:val="0"/>
+          <w:rFonts w:ascii="Times New Roman" w:hAnsi="Times New Roman" w:eastAsia="Times New Roman"/>
           <w:color w:val="1F4E79"/>
           <w:sz w:val="24"/>
         </w:rPr>
-        <w:t>Насчёт микрофона: я не вижу особой разницы между записью на USB-микрофон и на телефон. Лучше или нет — не могу сказать. Долго ли я буду решать дела? Да. Не хочу конкретизировать, какие дела: как-то не хочу, потому что я, в принципе, об этом никому особо не распространяюсь. Одно могу сказать: это надолго. Что ещё? Вообще у меня всё отлично. Прогулялась сегодня немного, подумала о жизни.</w:t>
+        <w:t>Насчёт микрофона: я не вижу особой разницы между записью на USB-микрофон и на телефон. Лучше или нет — не могу сказать. Долго ли я буду решать дела? Да. Не хочу конкретизировать, какие дела: как-то не хочу, потому, что я, в принципе, об этом никому особо не распространяюсь. Одно могу сказать: это надолго. Что ещё? Вообще у меня всё отлично. Прогулялась сегодня немного, подумала о жизни.</w:t>
       </w:r>
     </w:p>
     <w:p>
@@ -957,13 +817,11 @@
       </w:pPr>
       <w:r>
         <w:rPr>
-          <w:rFonts w:ascii="Times New Roman" w:hAnsi="Times New Roman" w:cs="Times New Roman" w:eastAsia="Times New Roman"/>
-          <w:b w:val="0"/>
-          <w:i w:val="0"/>
+          <w:rFonts w:ascii="Times New Roman" w:hAnsi="Times New Roman" w:eastAsia="Times New Roman"/>
           <w:color w:val="C00000"/>
           <w:sz w:val="24"/>
         </w:rPr>
-        <w:t>Главное, чтобы это было что-то такое обычное. Ну, не знаю, если со здоровьем — надо когда-нибудь сходить к стоматологу или что-то такое. Как я ходил, например: 10 дней нужно проходить, чтобы укрепить дёсны, уколы делать надо, в течение 10 дней каждый день ходить. Если такого плана — то нормально. Если что-то прямо очень тяжёлое, то, конечно, желательно, чтобы быстрее всё решалось. А так мы параллельно живём со своими делами и проблемами: они есть, и мы с ними. Параллельно, как две параллельные дороги, только в одну сторону. И так и живём, это нормально. Главное, чтобы они не вытеснили самое важное из жизни.</w:t>
+        <w:t>Главное, чтобы это было что-то такое обычное. Ну, не знаю, если со здоровьем — надо когда-нибудь сходить к стоматологу или что-то такое. Как я ходил, например: 10 дней нужно проходить, чтобы укрепить дёсны, уколы делать надо, в течение 10 дней каждый день ходить. Если такого плана — то нормально. Если что-то прямо очень тяжёлое, то, конечно, желательно, чтобы быстрее всё решалось. А так мы параллельно живём со своими делами и проблемами: они есть, и мы с ними. Параллельно, как две параллельные дороги, только в одну сторону. И так и живём, это нормально. Главное, чтобы они не вытеснили самое важное из-за жизни.</w:t>
       </w:r>
     </w:p>
     <w:p>
@@ -1095,13 +953,11 @@
       </w:pPr>
       <w:r>
         <w:rPr>
-          <w:rFonts w:ascii="Times New Roman" w:hAnsi="Times New Roman" w:cs="Times New Roman" w:eastAsia="Times New Roman"/>
-          <w:b w:val="0"/>
-          <w:i w:val="0"/>
+          <w:rFonts w:ascii="Times New Roman" w:hAnsi="Times New Roman" w:eastAsia="Times New Roman"/>
           <w:color w:val="C00000"/>
           <w:sz w:val="24"/>
         </w:rPr>
-        <w:t>Ложись спать 😘</w:t>
+        <w:t>Ложись спать 😘.</w:t>
       </w:r>
     </w:p>
     <w:p>
@@ -1187,13 +1043,11 @@
       </w:pPr>
       <w:r>
         <w:rPr>
-          <w:rFonts w:ascii="Times New Roman" w:hAnsi="Times New Roman" w:cs="Times New Roman" w:eastAsia="Times New Roman"/>
-          <w:b w:val="0"/>
-          <w:i w:val="0"/>
+          <w:rFonts w:ascii="Times New Roman" w:hAnsi="Times New Roman" w:eastAsia="Times New Roman"/>
           <w:color w:val="C00000"/>
           <w:sz w:val="24"/>
         </w:rPr>
-        <w:t>Да что ж такое.</w:t>
+        <w:t>Да, что ж такое.</w:t>
       </w:r>
     </w:p>
     <w:p>
@@ -1391,151 +1245,11 @@
       </w:pPr>
       <w:r>
         <w:rPr>
-          <w:rFonts w:ascii="Times New Roman" w:hAnsi="Times New Roman" w:cs="Times New Roman" w:eastAsia="Times New Roman"/>
-          <w:b w:val="0"/>
-          <w:i w:val="0"/>
+          <w:rFonts w:ascii="Times New Roman" w:hAnsi="Times New Roman" w:eastAsia="Times New Roman"/>
           <w:color w:val="1F4E79"/>
           <w:sz w:val="24"/>
         </w:rPr>
-        <w:t>Меня, в принципе, удивляет вопрос, почему я пошла в полдвенадцатого ночи готовить гречку, хотя я не то чтобы любительница готовить.</w:t>
-      </w:r>
-    </w:p>
-    <w:p>
-      <w:pPr>
-        <w:spacing w:before="200" w:after="40"/>
-        <w:ind w:firstLine="0"/>
-      </w:pPr>
-      <w:r>
-        <w:rPr>
-          <w:rFonts w:ascii="Times New Roman" w:hAnsi="Times New Roman" w:cs="Times New Roman" w:eastAsia="Times New Roman"/>
-          <w:b/>
-          <w:i w:val="0"/>
-          <w:color w:val="C00000"/>
-          <w:sz w:val="24"/>
-        </w:rPr>
-        <w:t>Kir</w:t>
-      </w:r>
-      <w:r>
-        <w:rPr>
-          <w:rFonts w:ascii="Times New Roman" w:hAnsi="Times New Roman" w:cs="Times New Roman" w:eastAsia="Times New Roman"/>
-          <w:b w:val="0"/>
-          <w:i/>
-          <w:color w:val="6B6B6B"/>
-          <w:sz w:val="18"/>
-        </w:rPr>
-        <w:t xml:space="preserve">   ·   00:17</w:t>
-      </w:r>
-    </w:p>
-    <w:p>
-      <w:pPr>
-        <w:spacing w:after="160" w:line="276" w:lineRule="auto"/>
-        <w:ind w:firstLine="425"/>
-        <w:jc w:val="both"/>
-        <w:pBdr>
-          <w:left w:val="single" w:sz="12" w:space="8" w:color="C00000"/>
-        </w:pBdr>
-      </w:pPr>
-      <w:r>
-        <w:rPr>
-          <w:rFonts w:ascii="Times New Roman" w:hAnsi="Times New Roman" w:cs="Times New Roman" w:eastAsia="Times New Roman"/>
-          <w:b w:val="0"/>
-          <w:i w:val="0"/>
-          <w:color w:val="C00000"/>
-          <w:sz w:val="24"/>
-        </w:rPr>
-        <w:t>Ничего удивительного. Так работает механизм этой, как она называется, энергии танатоса. Танатос называется — которая отвечает за простые, скажем так, функции, то есть спать, например, есть. Не знаю, чтобы не ошибиться, не соврать. Спать — это точно эта функция. Насчёт ночью поесть: это как раз тоже она — она нам пытается сказать, что это круто, хотя на деле ничего не так хорошо, как днём, но мы всё равно хотим. И, кстати, самый большой соблазн именно в это время, особенно если знаешь, что что-то там есть. У меня тоже такая штука: иногда удаётся удержаться, иногда нет. С переменным успехом. Мы не должны останавливаться, должны дальше пытаться.</w:t>
-      </w:r>
-    </w:p>
-    <w:p>
-      <w:pPr>
-        <w:spacing w:before="200" w:after="40"/>
-        <w:ind w:firstLine="0"/>
-      </w:pPr>
-      <w:r>
-        <w:rPr>
-          <w:rFonts w:ascii="Times New Roman" w:hAnsi="Times New Roman" w:cs="Times New Roman" w:eastAsia="Times New Roman"/>
-          <w:b/>
-          <w:i w:val="0"/>
-          <w:color w:val="C00000"/>
-          <w:sz w:val="24"/>
-        </w:rPr>
-        <w:t>Kir</w:t>
-      </w:r>
-      <w:r>
-        <w:rPr>
-          <w:rFonts w:ascii="Times New Roman" w:hAnsi="Times New Roman" w:cs="Times New Roman" w:eastAsia="Times New Roman"/>
-          <w:b w:val="0"/>
-          <w:i/>
-          <w:color w:val="6B6B6B"/>
-          <w:sz w:val="18"/>
-        </w:rPr>
-        <w:t xml:space="preserve">   ·   12:14</w:t>
-      </w:r>
-    </w:p>
-    <w:p>
-      <w:pPr>
-        <w:spacing w:after="160" w:line="276" w:lineRule="auto"/>
-        <w:ind w:firstLine="425"/>
-        <w:jc w:val="both"/>
-        <w:pBdr>
-          <w:left w:val="single" w:sz="12" w:space="8" w:color="C00000"/>
-        </w:pBdr>
-      </w:pPr>
-      <w:r>
-        <w:rPr>
-          <w:rFonts w:ascii="Times New Roman" w:hAnsi="Times New Roman" w:cs="Times New Roman" w:eastAsia="Times New Roman"/>
-          <w:b w:val="0"/>
-          <w:i w:val="0"/>
-          <w:color w:val="C00000"/>
-          <w:sz w:val="24"/>
-        </w:rPr>
-        <w:t>Добрый день, ну что, как дела?</w:t>
-      </w:r>
-    </w:p>
-    <w:p>
-      <w:pPr>
-        <w:spacing w:before="200" w:after="40"/>
-        <w:ind w:firstLine="0"/>
-      </w:pPr>
-      <w:r>
-        <w:rPr>
-          <w:rFonts w:ascii="Times New Roman" w:hAnsi="Times New Roman" w:cs="Times New Roman" w:eastAsia="Times New Roman"/>
-          <w:b/>
-          <w:i w:val="0"/>
-          <w:color w:val="1F4E79"/>
-          <w:sz w:val="24"/>
-        </w:rPr>
-        <w:t>Анфи</w:t>
-      </w:r>
-      <w:r>
-        <w:rPr>
-          <w:rFonts w:ascii="Times New Roman" w:hAnsi="Times New Roman" w:cs="Times New Roman" w:eastAsia="Times New Roman"/>
-          <w:b w:val="0"/>
-          <w:i/>
-          <w:color w:val="6B6B6B"/>
-          <w:sz w:val="18"/>
-        </w:rPr>
-        <w:t xml:space="preserve">   ·   12:15</w:t>
-      </w:r>
-    </w:p>
-    <w:p>
-      <w:pPr>
-        <w:spacing w:after="160" w:line="276" w:lineRule="auto"/>
-        <w:ind w:firstLine="425"/>
-        <w:jc w:val="both"/>
-        <w:pBdr>
-          <w:left w:val="single" w:sz="12" w:space="8" w:color="1F4E79"/>
-        </w:pBdr>
-      </w:pPr>
-      <w:r>
-        <w:rPr>
-          <w:rFonts w:ascii="Times New Roman" w:hAnsi="Times New Roman" w:cs="Times New Roman" w:eastAsia="Times New Roman"/>
-          <w:b w:val="0"/>
-          <w:i w:val="0"/>
-          <w:color w:val="1F4E79"/>
-          <w:sz w:val="24"/>
-        </w:rPr>
-        <w:t>Привет, всё отлично, у тебя как?</w:t>
+        <w:t>Меня, в принципе, удивляет вопрос, почему я пошла в полдвенадцатого ночи готовить гречку, хотя я не то, чтобы любительница готовить.</w:t>
       </w:r>
     </w:p>
     <w:p>
@@ -1575,13 +1289,11 @@
       </w:pPr>
       <w:r>
         <w:rPr>
-          <w:rFonts w:ascii="Times New Roman" w:hAnsi="Times New Roman" w:cs="Times New Roman" w:eastAsia="Times New Roman"/>
-          <w:b w:val="0"/>
-          <w:i w:val="0"/>
+          <w:rFonts w:ascii="Times New Roman" w:hAnsi="Times New Roman" w:eastAsia="Times New Roman"/>
           <w:color w:val="C00000"/>
           <w:sz w:val="24"/>
         </w:rPr>
-        <w:t>Жду, пока чайник закипит. Ещё поставил свёклу варить. Это такая длинная песня, что здесь главное вовремя прийти потом. Надо таймер поставить. Я обычно ставлю таймер, потому что выходишь, а она уже переваренная.</w:t>
+        <w:t>Жду, пока чайник закипит. Ещё поставил свёклу варить. Это такая длинная песня, что здесь главное вовремя прийти потом. Надо таймер поставить. Я обычно ставлю таймер, потому, что выходишь, а она уже переваренная.</w:t>
       </w:r>
     </w:p>
     <w:p>
@@ -1667,13 +1379,11 @@
       </w:pPr>
       <w:r>
         <w:rPr>
-          <w:rFonts w:ascii="Times New Roman" w:hAnsi="Times New Roman" w:cs="Times New Roman" w:eastAsia="Times New Roman"/>
-          <w:b w:val="0"/>
-          <w:i w:val="0"/>
+          <w:rFonts w:ascii="Times New Roman" w:hAnsi="Times New Roman" w:eastAsia="Times New Roman"/>
           <w:color w:val="C00000"/>
           <w:sz w:val="24"/>
         </w:rPr>
-        <w:t>Вот это странно сделано как-то. Почему, если человек решил поменять что-либо, другой этого не видит? Только надо удалить его сначала, а потом добавить, и тогда это немножко странно. Я считаю, человек может переименовывать, или хотя бы опцию могут добавить такую. Допустим, просто дать свободу настроек. Или не менять имя, если его меняет собеседник. Либо наоборот: видеть, сообщать о том, что он поменял. Это будет справедливо, потому что иногда получается странно всё это.</w:t>
+        <w:t>Вот это странно сделано как-то. Почему, если человек решил поменять что-либо, другой этого не видит? Только надо удалить его сначала, а потом добавить, и тогда это немножко странно. Я считаю, человек может переименовывать, или, хотя бы опцию могут добавить такую. Допустим, просто дать свободу настроек. Или не менять имя, если его меняет собеседник. Либо наоборот: видеть, сообщать о том, что он поменял. Это будет справедливо, потому, что иногда получается странно всё это.</w:t>
       </w:r>
     </w:p>
     <w:p>
@@ -1713,13 +1423,11 @@
       </w:pPr>
       <w:r>
         <w:rPr>
-          <w:rFonts w:ascii="Times New Roman" w:hAnsi="Times New Roman" w:cs="Times New Roman" w:eastAsia="Times New Roman"/>
-          <w:b w:val="0"/>
-          <w:i w:val="0"/>
+          <w:rFonts w:ascii="Times New Roman" w:hAnsi="Times New Roman" w:eastAsia="Times New Roman"/>
           <w:color w:val="1F4E79"/>
           <w:sz w:val="24"/>
         </w:rPr>
-        <w:t>Я думаю, в этом и смысл добавления кого-то в контакты: ты добавил человека в контакты и знаешь, что это за человек, ты сам его туда записал и всё такое. А если хочешь видеть, меняет человек имя или нет, то лучше его вообще не добавлять в контакты.</w:t>
+        <w:t>Я думаю, в этом и смысл добавления кого-то в контакты: ты добавил человека в контакты и знаешь, что это за человек, ты сам его туда записал и всё такое. А, если хочешь видеть, меняет человек имя или нет, то лучше его вообще не добавлять в контакты.</w:t>
       </w:r>
     </w:p>
     <w:p>
@@ -1759,59 +1467,11 @@
       </w:pPr>
       <w:r>
         <w:rPr>
-          <w:rFonts w:ascii="Times New Roman" w:hAnsi="Times New Roman" w:cs="Times New Roman" w:eastAsia="Times New Roman"/>
-          <w:b w:val="0"/>
-          <w:i w:val="0"/>
+          <w:rFonts w:ascii="Times New Roman" w:hAnsi="Times New Roman" w:eastAsia="Times New Roman"/>
           <w:color w:val="C00000"/>
           <w:sz w:val="24"/>
         </w:rPr>
-        <w:t>Не добавлять неудобно, потому что когда делаешь перепост какой-нибудь, пересылку, ну и вообще, то приходится искать среди переписок. А лучше, когда среди контактов ищешь.</w:t>
-      </w:r>
-    </w:p>
-    <w:p>
-      <w:pPr>
-        <w:spacing w:before="200" w:after="40"/>
-        <w:ind w:firstLine="0"/>
-      </w:pPr>
-      <w:r>
-        <w:rPr>
-          <w:rFonts w:ascii="Times New Roman" w:hAnsi="Times New Roman" w:cs="Times New Roman" w:eastAsia="Times New Roman"/>
-          <w:b/>
-          <w:i w:val="0"/>
-          <w:color w:val="C00000"/>
-          <w:sz w:val="24"/>
-        </w:rPr>
-        <w:t>Kir</w:t>
-      </w:r>
-      <w:r>
-        <w:rPr>
-          <w:rFonts w:ascii="Times New Roman" w:hAnsi="Times New Roman" w:cs="Times New Roman" w:eastAsia="Times New Roman"/>
-          <w:b w:val="0"/>
-          <w:i/>
-          <w:color w:val="6B6B6B"/>
-          <w:sz w:val="18"/>
-        </w:rPr>
-        <w:t xml:space="preserve">   ·   20:28</w:t>
-      </w:r>
-    </w:p>
-    <w:p>
-      <w:pPr>
-        <w:spacing w:after="160" w:line="276" w:lineRule="auto"/>
-        <w:ind w:firstLine="425"/>
-        <w:jc w:val="both"/>
-        <w:pBdr>
-          <w:left w:val="single" w:sz="12" w:space="8" w:color="C00000"/>
-        </w:pBdr>
-      </w:pPr>
-      <w:r>
-        <w:rPr>
-          <w:rFonts w:ascii="Times New Roman" w:hAnsi="Times New Roman" w:cs="Times New Roman" w:eastAsia="Times New Roman"/>
-          <w:b w:val="0"/>
-          <w:i w:val="0"/>
-          <w:color w:val="C00000"/>
-          <w:sz w:val="24"/>
-        </w:rPr>
-        <w:t>Здравствуйте! Что вы делаете? Хотите ли созвониться? Но не на 3 часа, на 20 минут.</w:t>
+        <w:t>Не добавлять неудобно, потому что, когда делаешь перепост какой-нибудь, пересылку, ну и вообще, то приходится искать среди переписок. А лучше, когда среди контактов ищешь.</w:t>
       </w:r>
     </w:p>
     <w:p>
@@ -1917,79 +1577,11 @@
       </w:pPr>
       <w:r>
         <w:rPr>
-          <w:rFonts w:ascii="Times New Roman" w:hAnsi="Times New Roman" w:cs="Times New Roman" w:eastAsia="Times New Roman"/>
-          <w:b w:val="0"/>
-          <w:i w:val="0"/>
+          <w:rFonts w:ascii="Times New Roman" w:hAnsi="Times New Roman" w:eastAsia="Times New Roman"/>
           <w:color w:val="C00000"/>
           <w:sz w:val="24"/>
         </w:rPr>
-        <w:t>Kirill Fandeev. One of the parts of the work «The Wheel of Time». Кирилл Фандеев. Одна из партий произведения «Колесо времени».</w:t>
-      </w:r>
-    </w:p>
-    <w:p>
-      <w:pPr>
-        <w:spacing w:before="360" w:after="160"/>
-        <w:ind w:firstLine="0"/>
-        <w:jc w:val="left"/>
-        <w:pBdr>
-          <w:bottom w:val="single" w:sz="8" w:space="6" w:color="2E5A3C"/>
-        </w:pBdr>
-      </w:pPr>
-      <w:r>
-        <w:rPr>
-          <w:rFonts w:ascii="Times New Roman" w:hAnsi="Times New Roman" w:cs="Times New Roman" w:eastAsia="Times New Roman"/>
-          <w:b/>
-          <w:i w:val="0"/>
-          <w:color w:val="2E5A3C"/>
-          <w:sz w:val="26"/>
-        </w:rPr>
-        <w:t>12 февраля 2025</w:t>
-      </w:r>
-    </w:p>
-    <w:p>
-      <w:pPr>
-        <w:spacing w:before="200" w:after="40"/>
-        <w:ind w:firstLine="0"/>
-      </w:pPr>
-      <w:r>
-        <w:rPr>
-          <w:rFonts w:ascii="Times New Roman" w:hAnsi="Times New Roman" w:cs="Times New Roman" w:eastAsia="Times New Roman"/>
-          <w:b/>
-          <w:i w:val="0"/>
-          <w:color w:val="C00000"/>
-          <w:sz w:val="24"/>
-        </w:rPr>
-        <w:t>Kir</w:t>
-      </w:r>
-      <w:r>
-        <w:rPr>
-          <w:rFonts w:ascii="Times New Roman" w:hAnsi="Times New Roman" w:cs="Times New Roman" w:eastAsia="Times New Roman"/>
-          <w:b w:val="0"/>
-          <w:i/>
-          <w:color w:val="6B6B6B"/>
-          <w:sz w:val="18"/>
-        </w:rPr>
-        <w:t xml:space="preserve">   ·   23:23</w:t>
-      </w:r>
-    </w:p>
-    <w:p>
-      <w:pPr>
-        <w:spacing w:after="160" w:line="276" w:lineRule="auto"/>
-        <w:ind w:firstLine="425"/>
-        <w:jc w:val="both"/>
-        <w:pBdr>
-          <w:left w:val="single" w:sz="12" w:space="8" w:color="C00000"/>
-        </w:pBdr>
-      </w:pPr>
-      <w:r>
-        <w:rPr>
-          <w:rFonts w:ascii="Times New Roman" w:hAnsi="Times New Roman" w:cs="Times New Roman" w:eastAsia="Times New Roman"/>
-          <w:b w:val="0"/>
-          <w:i w:val="0"/>
-          <w:color w:val="C00000"/>
-          <w:sz w:val="24"/>
-        </w:rPr>
-        <w:t>Ну как?</w:t>
+        <w:t>Kirill Fandeev. One of the parts of the work «The Wheel of Time». Кирилл Фандеев. Одна из-за партий произведения «Колесо времени».</w:t>
       </w:r>
     </w:p>
     <w:p>
@@ -2161,13 +1753,11 @@
       </w:pPr>
       <w:r>
         <w:rPr>
-          <w:rFonts w:ascii="Times New Roman" w:hAnsi="Times New Roman" w:cs="Times New Roman" w:eastAsia="Times New Roman"/>
-          <w:b w:val="0"/>
-          <w:i w:val="0"/>
+          <w:rFonts w:ascii="Times New Roman" w:hAnsi="Times New Roman" w:eastAsia="Times New Roman"/>
           <w:color w:val="C00000"/>
           <w:sz w:val="24"/>
         </w:rPr>
-        <w:t>Добрый день, в эфире пятница. Как вообще дела? Что ты там продолжаешь делать свои дела? Меня атакуют заказчики со всех сторон, еле успеваю. Но я всё ещё надеюсь на подкасты, потому что дело хорошее. И то, что приняли на эти все площадки, — это хорошо: значит, можно свой материал куда-то проталкивать, и это абсолютно реально. Так что надеюсь, что когда-нибудь соберёмся и сделаем что-то интересное.</w:t>
+        <w:t>Добрый день, в эфире пятница. Как вообще дела? Что ты там продолжаешь делать свои дела? Меня атакуют заказчики со всех сторон, еле успеваю. Но я всё ещё надеюсь на подкасты, потому, что дело хорошее. И то, что приняли на эти все площадки, — это хорошо: значит, можно свой материал куда-то проталкивать, и это абсолютно реально. Так, что надеюсь, что когда-нибудь соберёмся и сделаем что-то интересное.</w:t>
       </w:r>
     </w:p>
     <w:p>
@@ -2365,13 +1955,11 @@
       </w:pPr>
       <w:r>
         <w:rPr>
-          <w:rFonts w:ascii="Times New Roman" w:hAnsi="Times New Roman" w:cs="Times New Roman" w:eastAsia="Times New Roman"/>
-          <w:b w:val="0"/>
-          <w:i w:val="0"/>
+          <w:rFonts w:ascii="Times New Roman" w:hAnsi="Times New Roman" w:eastAsia="Times New Roman"/>
           <w:color w:val="C00000"/>
           <w:sz w:val="24"/>
         </w:rPr>
-        <w:t>Кстати, неплохая штука Gemini, которая встроена в телефон, — ассистент Google. Ассистент, встроенный в Android, только они обновили, и можно подключить Gemini — полноценную нейронку. А раньше был «Окей, Google». И она лучше, чем GPT, потому что GPT всё время требует подписку, там расширенный голосовой режим. А эта прямо болтает с достаточно неплохим голосом, можно просто болтать. Держишь кнопку питания — и эта штука включается. Можно напоминание сделать: «Напомни мне завтра то-то». Можно список дел составить, потом нажать кнопку питания, она включается, ты говоришь: «Напомни, какие у меня сегодня дела» — и она перечисляет. Очень удобная штука: и напоминалка, и болталка, можно с ней всякое обсудить.</w:t>
+        <w:t>Кстати, неплохая штука Gemini, которая встроена в телефон, — ассистент Google. Ассистент, встроенный в Android, только они обновили, и можно подключить Gemini — полноценную нейронку. А раньше был «Окей, Google». И она лучше, чем GPT, потому, что GPT всё время требует подписку, там расширенный голосовой режим. А эта прямо болтает с достаточно неплохим голосом, можно просто болтать. Держишь кнопку питания — и эта штука включается. Можно напоминание сделать: «Напомни мне завтра то-то». Можно список дел составить, потом нажать кнопку питания, она включается, ты говоришь: «Напомни, какие у меня сегодня дела» — и она перечисляет. Очень удобная штука: и напоминалка, и болталка, можно с ней всякое обсудить.</w:t>
       </w:r>
     </w:p>
     <w:p>
@@ -2422,98 +2010,6 @@
     </w:p>
     <w:p>
       <w:pPr>
-        <w:spacing w:before="200" w:after="40"/>
-        <w:ind w:firstLine="0"/>
-      </w:pPr>
-      <w:r>
-        <w:rPr>
-          <w:rFonts w:ascii="Times New Roman" w:hAnsi="Times New Roman" w:cs="Times New Roman" w:eastAsia="Times New Roman"/>
-          <w:b/>
-          <w:i w:val="0"/>
-          <w:color w:val="C00000"/>
-          <w:sz w:val="24"/>
-        </w:rPr>
-        <w:t>Kir</w:t>
-      </w:r>
-      <w:r>
-        <w:rPr>
-          <w:rFonts w:ascii="Times New Roman" w:hAnsi="Times New Roman" w:cs="Times New Roman" w:eastAsia="Times New Roman"/>
-          <w:b w:val="0"/>
-          <w:i/>
-          <w:color w:val="6B6B6B"/>
-          <w:sz w:val="18"/>
-        </w:rPr>
-        <w:t xml:space="preserve">   ·   23:46</w:t>
-      </w:r>
-    </w:p>
-    <w:p>
-      <w:pPr>
-        <w:spacing w:after="160" w:line="276" w:lineRule="auto"/>
-        <w:ind w:firstLine="425"/>
-        <w:jc w:val="both"/>
-        <w:pBdr>
-          <w:left w:val="single" w:sz="12" w:space="8" w:color="C00000"/>
-        </w:pBdr>
-      </w:pPr>
-      <w:r>
-        <w:rPr>
-          <w:rFonts w:ascii="Times New Roman" w:hAnsi="Times New Roman" w:cs="Times New Roman" w:eastAsia="Times New Roman"/>
-          <w:b w:val="0"/>
-          <w:i w:val="0"/>
-          <w:color w:val="C00000"/>
-          <w:sz w:val="24"/>
-        </w:rPr>
-        <w:t>У тебя работает она?</w:t>
-      </w:r>
-    </w:p>
-    <w:p>
-      <w:pPr>
-        <w:spacing w:before="200" w:after="40"/>
-        <w:ind w:firstLine="0"/>
-      </w:pPr>
-      <w:r>
-        <w:rPr>
-          <w:rFonts w:ascii="Times New Roman" w:hAnsi="Times New Roman" w:cs="Times New Roman" w:eastAsia="Times New Roman"/>
-          <w:b/>
-          <w:i w:val="0"/>
-          <w:color w:val="1F4E79"/>
-          <w:sz w:val="24"/>
-        </w:rPr>
-        <w:t>Анфи</w:t>
-      </w:r>
-      <w:r>
-        <w:rPr>
-          <w:rFonts w:ascii="Times New Roman" w:hAnsi="Times New Roman" w:cs="Times New Roman" w:eastAsia="Times New Roman"/>
-          <w:b w:val="0"/>
-          <w:i/>
-          <w:color w:val="6B6B6B"/>
-          <w:sz w:val="18"/>
-        </w:rPr>
-        <w:t xml:space="preserve">   ·   23:59</w:t>
-      </w:r>
-    </w:p>
-    <w:p>
-      <w:pPr>
-        <w:spacing w:after="160" w:line="276" w:lineRule="auto"/>
-        <w:ind w:firstLine="425"/>
-        <w:jc w:val="both"/>
-        <w:pBdr>
-          <w:left w:val="single" w:sz="12" w:space="8" w:color="1F4E79"/>
-        </w:pBdr>
-      </w:pPr>
-      <w:r>
-        <w:rPr>
-          <w:rFonts w:ascii="Times New Roman" w:hAnsi="Times New Roman" w:cs="Times New Roman" w:eastAsia="Times New Roman"/>
-          <w:b w:val="0"/>
-          <w:i w:val="0"/>
-          <w:color w:val="1F4E79"/>
-          <w:sz w:val="24"/>
-        </w:rPr>
-        <w:t>Спасибо. А насчёт этой нейронки — не знаю, работает или нет, мне как-то пофиг на это, не проверяла.</w:t>
-      </w:r>
-    </w:p>
-    <w:p>
-      <w:pPr>
         <w:spacing w:before="360" w:after="160"/>
         <w:ind w:firstLine="0"/>
         <w:jc w:val="left"/>
@@ -2621,7 +2117,7 @@
           <w:color w:val="C00000"/>
           <w:sz w:val="24"/>
         </w:rPr>
-        <w:t>Получилось усмирить ударник?</w:t>
+        <w:t>Это хорошо, главное, чтобы неправильности между собой сочетались — и тогда ок.</w:t>
       </w:r>
     </w:p>
     <w:p>
@@ -2661,13 +2157,11 @@
       </w:pPr>
       <w:r>
         <w:rPr>
-          <w:rFonts w:ascii="Times New Roman" w:hAnsi="Times New Roman" w:cs="Times New Roman" w:eastAsia="Times New Roman"/>
-          <w:b w:val="0"/>
-          <w:i w:val="0"/>
+          <w:rFonts w:ascii="Times New Roman" w:hAnsi="Times New Roman" w:eastAsia="Times New Roman"/>
           <w:color w:val="C00000"/>
           <w:sz w:val="24"/>
         </w:rPr>
-        <w:t>Нет, просто удалось его сделать так же неправильно, как гармонию )</w:t>
+        <w:t>Я ж не композитор и потому квадрат местами ромбиком заменил, тем самым создав новую реальность звукового восприятия и открыл новый этап эволюции музыки🥸🤔🫣🤣.</w:t>
       </w:r>
     </w:p>
     <w:p>
@@ -2713,7 +2207,7 @@
           <w:color w:val="C00000"/>
           <w:sz w:val="24"/>
         </w:rPr>
-        <w:t>Это хорошо, главное, чтобы неправильности между собой сочетались — и тогда ок.</w:t>
+        <w:t>Нейропластичность ударно-гармонических линий.</w:t>
       </w:r>
     </w:p>
     <w:p>
@@ -2759,98 +2253,6 @@
           <w:color w:val="C00000"/>
           <w:sz w:val="24"/>
         </w:rPr>
-        <w:t>Я ж не композитор и потому квадрат местами ромбиком заменил, тем самым создав новую реальность звукового восприятия и открыл новый этап эволюции музыки🥸🤔🫣🤣</w:t>
-      </w:r>
-    </w:p>
-    <w:p>
-      <w:pPr>
-        <w:spacing w:before="200" w:after="40"/>
-        <w:ind w:firstLine="0"/>
-      </w:pPr>
-      <w:r>
-        <w:rPr>
-          <w:rFonts w:ascii="Times New Roman" w:hAnsi="Times New Roman" w:cs="Times New Roman" w:eastAsia="Times New Roman"/>
-          <w:b/>
-          <w:i w:val="0"/>
-          <w:color w:val="C00000"/>
-          <w:sz w:val="24"/>
-        </w:rPr>
-        <w:t>Kir</w:t>
-      </w:r>
-      <w:r>
-        <w:rPr>
-          <w:rFonts w:ascii="Times New Roman" w:hAnsi="Times New Roman" w:cs="Times New Roman" w:eastAsia="Times New Roman"/>
-          <w:b w:val="0"/>
-          <w:i/>
-          <w:color w:val="6B6B6B"/>
-          <w:sz w:val="18"/>
-        </w:rPr>
-        <w:t xml:space="preserve">   ·   14:31</w:t>
-      </w:r>
-    </w:p>
-    <w:p>
-      <w:pPr>
-        <w:spacing w:after="160" w:line="276" w:lineRule="auto"/>
-        <w:ind w:firstLine="425"/>
-        <w:jc w:val="both"/>
-        <w:pBdr>
-          <w:left w:val="single" w:sz="12" w:space="8" w:color="C00000"/>
-        </w:pBdr>
-      </w:pPr>
-      <w:r>
-        <w:rPr>
-          <w:rFonts w:ascii="Times New Roman" w:hAnsi="Times New Roman" w:cs="Times New Roman" w:eastAsia="Times New Roman"/>
-          <w:b w:val="0"/>
-          <w:i w:val="0"/>
-          <w:color w:val="C00000"/>
-          <w:sz w:val="24"/>
-        </w:rPr>
-        <w:t>Нейропластичность ударно-гармонических линий.</w:t>
-      </w:r>
-    </w:p>
-    <w:p>
-      <w:pPr>
-        <w:spacing w:before="200" w:after="40"/>
-        <w:ind w:firstLine="0"/>
-      </w:pPr>
-      <w:r>
-        <w:rPr>
-          <w:rFonts w:ascii="Times New Roman" w:hAnsi="Times New Roman" w:cs="Times New Roman" w:eastAsia="Times New Roman"/>
-          <w:b/>
-          <w:i w:val="0"/>
-          <w:color w:val="C00000"/>
-          <w:sz w:val="24"/>
-        </w:rPr>
-        <w:t>Kir</w:t>
-      </w:r>
-      <w:r>
-        <w:rPr>
-          <w:rFonts w:ascii="Times New Roman" w:hAnsi="Times New Roman" w:cs="Times New Roman" w:eastAsia="Times New Roman"/>
-          <w:b w:val="0"/>
-          <w:i/>
-          <w:color w:val="6B6B6B"/>
-          <w:sz w:val="18"/>
-        </w:rPr>
-        <w:t xml:space="preserve">   ·   14:31</w:t>
-      </w:r>
-    </w:p>
-    <w:p>
-      <w:pPr>
-        <w:spacing w:after="160" w:line="276" w:lineRule="auto"/>
-        <w:ind w:firstLine="425"/>
-        <w:jc w:val="both"/>
-        <w:pBdr>
-          <w:left w:val="single" w:sz="12" w:space="8" w:color="C00000"/>
-        </w:pBdr>
-      </w:pPr>
-      <w:r>
-        <w:rPr>
-          <w:rFonts w:ascii="Times New Roman" w:hAnsi="Times New Roman" w:cs="Times New Roman" w:eastAsia="Times New Roman"/>
-          <w:b w:val="0"/>
-          <w:i w:val="0"/>
-          <w:color w:val="C00000"/>
-          <w:sz w:val="24"/>
-        </w:rPr>
         <w:t>Ну это уж совсем. Держите себя в руках, пожалуйста.</w:t>
       </w:r>
     </w:p>
@@ -2911,13 +2313,11 @@
       </w:pPr>
       <w:r>
         <w:rPr>
-          <w:rFonts w:ascii="Times New Roman" w:hAnsi="Times New Roman" w:cs="Times New Roman" w:eastAsia="Times New Roman"/>
-          <w:b w:val="0"/>
-          <w:i w:val="0"/>
+          <w:rFonts w:ascii="Times New Roman" w:hAnsi="Times New Roman" w:eastAsia="Times New Roman"/>
           <w:color w:val="C00000"/>
           <w:sz w:val="24"/>
         </w:rPr>
-        <w:t>Народ, продолжение истории. Я понял, в чём развод. Позвонили мне через какое-то время люди со словами: «Мы вот из полиции, наша система антимошенник распознала ключевые слова, поэтому сейчас мы должны с вами пройти все процедуры». То есть вся эта фраза Роскомнадзора, от которой я охренел, — это была часть мошеннической схемы. Сработает она следующим образом: тебе звонят, какую-то мутную фигню рассказывают, просят какой-то код, потом типа как будто РКН это прервал, и через время перезвонят люди со словами, что вам звонили мошенники, давайте их вместе будем карать — и вот тут ты как раз попадаешься на удочку мошенников. Скорее всего. У меня что: мне очень интересно было, как дальше это всё развивается, но вот в чём идея. То есть фраза Роскомнадзора, от которой я охренел, — со словами «Роскомнадзор следит за этими самыми разговорами» — это тоже было всё ловко. Так что бдите и берегите себя и свои денежки.</w:t>
+        <w:t>Народ, продолжение истории. Я понял, в чём развод. Позвонили мне через какое-то время люди со словами: «Мы. Вот из-за полиции, наша система антимошенник распознала ключевые слова, поэтому сейчас мы должны с вами пройти все процедуры». То есть вся эта фраза Роскомнадзора, от которой я охренел, — это была часть мошеннической схемы. Сработает она следующим образом: тебе звонят, какую-то мутную фигню рассказывают, просят какой-то код, потом типа как будто РКН это прервал, и через время перезвонят люди со словами, что вам звонили мошенники, давайте их вместе будем карать — и. Вот тут ты как раз попадаешься на удочку мошенников. Скорее всего. У меня что: мне очень интересно было, как дальше это всё развивается, но. Вот в чём идея. То есть фраза Роскомнадзора, от которой я охренел, — со словами «Роскомнадзор следит за этими самыми разговорами» — это тоже было всё ловко. Так, что бдите и берегите себя и свои денежки.</w:t>
       </w:r>
     </w:p>
     <w:p>
@@ -3227,13 +2627,11 @@
       </w:pPr>
       <w:r>
         <w:rPr>
-          <w:rFonts w:ascii="Times New Roman" w:hAnsi="Times New Roman" w:cs="Times New Roman" w:eastAsia="Times New Roman"/>
-          <w:b w:val="0"/>
-          <w:i w:val="0"/>
+          <w:rFonts w:ascii="Times New Roman" w:hAnsi="Times New Roman" w:eastAsia="Times New Roman"/>
           <w:color w:val="C00000"/>
           <w:sz w:val="24"/>
         </w:rPr>
-        <w:t>Добрый день. Как тебе такая идея — искусственный мозг? Вообще интересную вещь сделали. Думаю, на нём вполне можно построить компьютер. Представь: такие компьютеры будут на мозгах работать — на искусственных мозгах. Эта идея хорошая, мне кажется. Это же всё-таки биологический этот самый, и по идее туда можно загрузить нейронку. И это считается человеком. Если там будет работать эта сетка, которая в нейронках работает, то мы получим в итоге то, что неотличимо от человека. Плюс сделают ещё тела, похожие на человеческие, разработают так, чтобы они имели миллиарды мышц, микромышц, и так далее. И они будут так же двигаться, мимика, всё будет как у человека. И плюс этот мозг, он ещё и биологический, и туда можно загрузить. Не знаю, можно или нельзя, но если можно будет, то там будет, конечно, нечто.</w:t>
+        <w:t>Добрый день. Как тебе такая идея — искусственный мозг? Вообще интересную вещь сделали. Думаю, на нём вполне можно построить компьютер. Представь: такие компьютеры будут на мозгах работать — на искусственных мозгах. Эта идея хорошая, мне кажется. Это же всё-таки биологический этот самый, и по идее туда можно загрузить нейронку. И это считается человеком. Если там будет работать эта сетка, которая в нейронках работает, то мы получим в итоге то, что неотличимо от человека. Плюс сделают ещё тела, похожие на человеческие, разработают так, чтобы они имели миллиарды мышц, микромышц, и так далее. И они будут так же двигаться, мимика, всё будет как у человека. И плюс этот мозг, он ещё и биологический, и туда можно загрузить. Не знаю, можно или нельзя, но, если можно будет, то там будет, конечно, нечто.</w:t>
       </w:r>
     </w:p>
     <w:p>
@@ -3503,13 +2901,11 @@
       </w:pPr>
       <w:r>
         <w:rPr>
-          <w:rFonts w:ascii="Times New Roman" w:hAnsi="Times New Roman" w:cs="Times New Roman" w:eastAsia="Times New Roman"/>
-          <w:b w:val="0"/>
-          <w:i w:val="0"/>
+          <w:rFonts w:ascii="Times New Roman" w:hAnsi="Times New Roman" w:eastAsia="Times New Roman"/>
           <w:color w:val="C00000"/>
           <w:sz w:val="24"/>
         </w:rPr>
-        <w:t>Бабушка поспорила с Сёмой, что он не съест 25 её пельменей — на то, что он уберёт в квартире. И вот Сёма доедает 24-й пельмень, а 25-го в тарелке нет. Это всё, что надо знать о составлении договоров. По сути смешно.</w:t>
+        <w:t>Бабушка поспорила с Сёмой, что он не съест 25 её пельменей — на то, что он уберёт в квартире. И. Вот Сёма доедает 24-й пельмень, а 25-го в тарелке нет. Это всё, что надо знать о составлении договоров. По сути смешно.</w:t>
       </w:r>
     </w:p>
     <w:p>
@@ -3606,52 +3002,6 @@
     </w:p>
     <w:p>
       <w:pPr>
-        <w:spacing w:before="200" w:after="40"/>
-        <w:ind w:firstLine="0"/>
-      </w:pPr>
-      <w:r>
-        <w:rPr>
-          <w:rFonts w:ascii="Times New Roman" w:hAnsi="Times New Roman" w:cs="Times New Roman" w:eastAsia="Times New Roman"/>
-          <w:b/>
-          <w:i w:val="0"/>
-          <w:color w:val="C00000"/>
-          <w:sz w:val="24"/>
-        </w:rPr>
-        <w:t>Kir</w:t>
-      </w:r>
-      <w:r>
-        <w:rPr>
-          <w:rFonts w:ascii="Times New Roman" w:hAnsi="Times New Roman" w:cs="Times New Roman" w:eastAsia="Times New Roman"/>
-          <w:b w:val="0"/>
-          <w:i/>
-          <w:color w:val="6B6B6B"/>
-          <w:sz w:val="18"/>
-        </w:rPr>
-        <w:t xml:space="preserve">   ·   22:35</w:t>
-      </w:r>
-    </w:p>
-    <w:p>
-      <w:pPr>
-        <w:spacing w:after="160" w:line="276" w:lineRule="auto"/>
-        <w:ind w:firstLine="425"/>
-        <w:jc w:val="both"/>
-        <w:pBdr>
-          <w:left w:val="single" w:sz="12" w:space="8" w:color="C00000"/>
-        </w:pBdr>
-      </w:pPr>
-      <w:r>
-        <w:rPr>
-          <w:rFonts w:ascii="Times New Roman" w:hAnsi="Times New Roman" w:cs="Times New Roman" w:eastAsia="Times New Roman"/>
-          <w:b w:val="0"/>
-          <w:i w:val="0"/>
-          <w:color w:val="C00000"/>
-          <w:sz w:val="24"/>
-        </w:rPr>
-        <w:t>Не знаю, не смотрел никогда. А фантастику какую-нибудь?</w:t>
-      </w:r>
-    </w:p>
-    <w:p>
-      <w:pPr>
         <w:spacing w:before="360" w:after="160"/>
         <w:ind w:firstLine="0"/>
         <w:jc w:val="left"/>
@@ -4207,13 +3557,11 @@
       </w:pPr>
       <w:r>
         <w:rPr>
-          <w:rFonts w:ascii="Times New Roman" w:hAnsi="Times New Roman" w:cs="Times New Roman" w:eastAsia="Times New Roman"/>
-          <w:b w:val="0"/>
-          <w:i w:val="0"/>
+          <w:rFonts w:ascii="Times New Roman" w:hAnsi="Times New Roman" w:eastAsia="Times New Roman"/>
           <w:color w:val="1F4E79"/>
           <w:sz w:val="24"/>
         </w:rPr>
-        <w:t>Ну, я сама себя запрягла. Насчёт свободного времени я хз.</w:t>
+        <w:t>Ну, я сама себя запрягла. Насчёт свободного времени я ХЗ.</w:t>
       </w:r>
     </w:p>
     <w:p>
@@ -4687,13 +4035,11 @@
       </w:pPr>
       <w:r>
         <w:rPr>
-          <w:rFonts w:ascii="Times New Roman" w:hAnsi="Times New Roman" w:cs="Times New Roman" w:eastAsia="Times New Roman"/>
-          <w:b w:val="0"/>
-          <w:i w:val="0"/>
+          <w:rFonts w:ascii="Times New Roman" w:hAnsi="Times New Roman" w:eastAsia="Times New Roman"/>
           <w:color w:val="C00000"/>
           <w:sz w:val="24"/>
         </w:rPr>
-        <w:t>Пока да, сейчас физика звука, всё такое. Потом, всё равно, возможно, когда-нибудь придёт время интереса и к этому. Так что всё по периодам, скажем так.</w:t>
+        <w:t>Пока да, сейчас физика звука, всё такое. Потом, всё равно, возможно, когда-нибудь придёт время интереса и к этому. Так, что всё по периодам, скажем так.</w:t>
       </w:r>
     </w:p>
     <w:p>

</xml_diff>